<commit_message>
add fitur arsip dan video
</commit_message>
<xml_diff>
--- a/pre/Form Input Wawancara SDN 3 Ngrayun.docx
+++ b/pre/Form Input Wawancara SDN 3 Ngrayun.docx
@@ -3592,7 +3592,9 @@
           <w:color w:val="000000"/>
           <w:rtl w:val="0"/>
         </w:rPr>
-        <w:t xml:space="preserve">       | Jadwal: Minggu 1</w:t>
+        <w:t xml:space="preserve">       </w:t>
+        <w:tab/>
+        <w:t xml:space="preserve">| Jadwal: Minggu 1</w:t>
       </w:r>
       <w:r/>
     </w:p>
@@ -3619,7 +3621,9 @@
           <w:color w:val="000000"/>
           <w:rtl w:val="0"/>
         </w:rPr>
-        <w:t xml:space="preserve">Nama Ekskul:  Pramuka       | Jadwal: Minggu 2</w:t>
+        <w:t xml:space="preserve">Nama Ekskul:  Pramuka       </w:t>
+        <w:tab/>
+        <w:t xml:space="preserve">| Jadwal: Minggu 2</w:t>
       </w:r>
       <w:r/>
     </w:p>
@@ -3646,7 +3650,9 @@
           <w:color w:val="000000"/>
           <w:rtl w:val="0"/>
         </w:rPr>
-        <w:t xml:space="preserve">Nama Ekskul:  Olahraga      | Jadwal: Minggu 3</w:t>
+        <w:t xml:space="preserve">Nama Ekskul:  Olahraga     </w:t>
+        <w:tab/>
+        <w:t xml:space="preserve">| Jadwal: Minggu 3</w:t>
       </w:r>
       <w:r/>
     </w:p>
@@ -3673,7 +3679,10 @@
           <w:color w:val="000000"/>
           <w:rtl w:val="0"/>
         </w:rPr>
-        <w:t xml:space="preserve">Nama Ekskul:  Tari    | Jadwal: Minggu 4</w:t>
+        <w:t xml:space="preserve">Nama Ekskul:  Tari   </w:t>
+        <w:tab/>
+        <w:tab/>
+        <w:t xml:space="preserve">| Jadwal: Minggu 4</w:t>
       </w:r>
       <w:r/>
       <w:r/>

</xml_diff>